<commit_message>
minor changes (exlplained in the commit message)
-малки промени в началото на страниците (за да
няма повторение на код, не е променена
функционалност)
-скриптът за създаване на база добавя потребители,
паролата на всеки от тях е "password"
-отбелязах в изискванията, че съм направил
входа и регистрацията
</commit_message>
<xml_diff>
--- a/doctemplate_and_requirements/requirements.docx
+++ b/doctemplate_and_requirements/requirements.docx
@@ -1,6 +1,6 @@
 
 <file path=word/document.xml><?xml version="1.0" encoding="utf-8"?>
-<w:document xmlns:wpc="http://schemas.microsoft.com/office/word/2010/wordprocessingCanvas" xmlns:cx="http://schemas.microsoft.com/office/drawing/2014/chartex" xmlns:cx1="http://schemas.microsoft.com/office/drawing/2015/9/8/chartex" xmlns:cx2="http://schemas.microsoft.com/office/drawing/2015/10/21/chartex" xmlns:cx3="http://schemas.microsoft.com/office/drawing/2016/5/9/chartex" xmlns:cx4="http://schemas.microsoft.com/office/drawing/2016/5/10/chartex" xmlns:cx5="http://schemas.microsoft.com/office/drawing/2016/5/11/chartex" xmlns:cx6="http://schemas.microsoft.com/office/drawing/2016/5/12/chartex" xmlns:cx7="http://schemas.microsoft.com/office/drawing/2016/5/13/chartex" xmlns:cx8="http://schemas.microsoft.com/office/drawing/2016/5/14/chartex" xmlns:mc="http://schemas.openxmlformats.org/markup-compatibility/2006" xmlns:aink="http://schemas.microsoft.com/office/drawing/2016/ink" xmlns:am3d="http://schemas.microsoft.com/office/drawing/2017/model3d" xmlns:o="urn:schemas-microsoft-com:office:office" xmlns:oel="http://schemas.microsoft.com/office/2019/extlst" xmlns:r="http://schemas.openxmlformats.org/officeDocument/2006/relationships" xmlns:m="http://schemas.openxmlformats.org/officeDocument/2006/math" xmlns:v="urn:schemas-microsoft-com:vml" xmlns:wp14="http://schemas.microsoft.com/office/word/2010/wordprocessingDrawing" xmlns:wp="http://schemas.openxmlformats.org/drawingml/2006/wordprocessingDrawing" xmlns:w10="urn:schemas-microsoft-com:office:word" xmlns:w="http://schemas.openxmlformats.org/wordprocessingml/2006/main" xmlns:w14="http://schemas.microsoft.com/office/word/2010/wordml" xmlns:w15="http://schemas.microsoft.com/office/word/2012/wordml" xmlns:w16cex="http://schemas.microsoft.com/office/word/2018/wordml/cex" xmlns:w16cid="http://schemas.microsoft.com/office/word/2016/wordml/cid" xmlns:w16="http://schemas.microsoft.com/office/word/2018/wordml" xmlns:w16du="http://schemas.microsoft.com/office/word/2023/wordml/word16du" xmlns:w16sdtdh="http://schemas.microsoft.com/office/word/2020/wordml/sdtdatahash" xmlns:w16sdtfl="http://schemas.microsoft.com/office/word/2024/wordml/sdtformatlock" xmlns:w16se="http://schemas.microsoft.com/office/word/2015/wordml/symex" xmlns:wpg="http://schemas.microsoft.com/office/word/2010/wordprocessingGroup" xmlns:wpi="http://schemas.microsoft.com/office/word/2010/wordprocessingInk" xmlns:wne="http://schemas.microsoft.com/office/word/2006/wordml" xmlns:wps="http://schemas.microsoft.com/office/word/2010/wordprocessingShape" mc:Ignorable="w14 w15 w16se w16cid w16 w16cex w16sdtdh w16sdtfl w16du wp14">
+<w:document xmlns:wpc="http://schemas.microsoft.com/office/word/2010/wordprocessingCanvas" xmlns:cx="http://schemas.microsoft.com/office/drawing/2014/chartex" xmlns:mc="http://schemas.openxmlformats.org/markup-compatibility/2006" xmlns:o="urn:schemas-microsoft-com:office:office" xmlns:r="http://schemas.openxmlformats.org/officeDocument/2006/relationships" xmlns:m="http://schemas.openxmlformats.org/officeDocument/2006/math" xmlns:v="urn:schemas-microsoft-com:vml" xmlns:wp14="http://schemas.microsoft.com/office/word/2010/wordprocessingDrawing" xmlns:wp="http://schemas.openxmlformats.org/drawingml/2006/wordprocessingDrawing" xmlns:w10="urn:schemas-microsoft-com:office:word" xmlns:w="http://schemas.openxmlformats.org/wordprocessingml/2006/main" xmlns:w14="http://schemas.microsoft.com/office/word/2010/wordml" xmlns:w15="http://schemas.microsoft.com/office/word/2012/wordml" xmlns:w16se="http://schemas.microsoft.com/office/word/2015/wordml/symex" xmlns:wpg="http://schemas.microsoft.com/office/word/2010/wordprocessingGroup" xmlns:wpi="http://schemas.microsoft.com/office/word/2010/wordprocessingInk" xmlns:wne="http://schemas.microsoft.com/office/word/2006/wordml" xmlns:wps="http://schemas.microsoft.com/office/word/2010/wordprocessingShape" mc:Ignorable="w14 w15 w16se wp14">
   <w:body>
     <w:p>
       <w:pPr>
@@ -310,12 +310,31 @@
       </w:r>
       <w:r>
         <w:rPr>
+          <w:strike/>
           <w:color w:val="EE0000"/>
           <w:sz w:val="32"/>
           <w:szCs w:val="32"/>
         </w:rPr>
         <w:t>(МП-нисък приоритет)</w:t>
       </w:r>
+      <w:r>
+        <w:rPr>
+          <w:strike/>
+          <w:color w:val="EE0000"/>
+          <w:sz w:val="32"/>
+          <w:szCs w:val="32"/>
+          <w:lang w:val="en-US"/>
+        </w:rPr>
+        <w:t xml:space="preserve"> </w:t>
+      </w:r>
+      <w:r>
+        <w:rPr>
+          <w:color w:val="00B050"/>
+          <w:sz w:val="32"/>
+          <w:szCs w:val="32"/>
+        </w:rPr>
+        <w:t>готово</w:t>
+      </w:r>
     </w:p>
     <w:p>
       <w:pPr>
@@ -332,7 +351,16 @@
           <w:sz w:val="32"/>
           <w:szCs w:val="32"/>
         </w:rPr>
-        <w:t>След влизане/регистриране, потребителят влиза в страницата на профила си.</w:t>
+        <w:t>След влизане/регистриране, потребителят влиза в страницата на пр</w:t>
+      </w:r>
+      <w:bookmarkStart w:id="0" w:name="_GoBack"/>
+      <w:bookmarkEnd w:id="0"/>
+      <w:r>
+        <w:rPr>
+          <w:sz w:val="32"/>
+          <w:szCs w:val="32"/>
+        </w:rPr>
+        <w:t>офила си.</w:t>
       </w:r>
     </w:p>
     <w:p>
@@ -983,7 +1011,7 @@
           <w:lang w:val="en-US"/>
         </w:rPr>
       </w:pPr>
-      <w:bookmarkStart w:id="0" w:name="записванеТурнир"/>
+      <w:bookmarkStart w:id="1" w:name="записванеТурнир"/>
       <w:r>
         <w:rPr>
           <w:sz w:val="32"/>
@@ -1006,7 +1034,7 @@
         <w:t xml:space="preserve"> за турнир</w:t>
       </w:r>
     </w:p>
-    <w:bookmarkEnd w:id="0"/>
+    <w:bookmarkEnd w:id="1"/>
     <w:p>
       <w:pPr>
         <w:pStyle w:val="ListParagraph"/>
@@ -1147,7 +1175,7 @@
           <w:szCs w:val="32"/>
         </w:rPr>
       </w:pPr>
-      <w:bookmarkStart w:id="1" w:name="турнирСтраница"/>
+      <w:bookmarkStart w:id="2" w:name="турнирСтраница"/>
       <w:r>
         <w:rPr>
           <w:sz w:val="32"/>
@@ -1156,7 +1184,7 @@
         <w:t>Страница на турнир</w:t>
       </w:r>
     </w:p>
-    <w:bookmarkEnd w:id="1"/>
+    <w:bookmarkEnd w:id="2"/>
     <w:p>
       <w:pPr>
         <w:pStyle w:val="ListParagraph"/>
@@ -1345,7 +1373,27 @@
           <w:szCs w:val="32"/>
           <w:lang w:val="en-US"/>
         </w:rPr>
-        <w:t>/xlsx).</w:t>
+        <w:t>/</w:t>
+      </w:r>
+      <w:proofErr w:type="spellStart"/>
+      <w:r>
+        <w:rPr>
+          <w:color w:val="EE0000"/>
+          <w:sz w:val="32"/>
+          <w:szCs w:val="32"/>
+          <w:lang w:val="en-US"/>
+        </w:rPr>
+        <w:t>xlsx</w:t>
+      </w:r>
+      <w:proofErr w:type="spellEnd"/>
+      <w:r>
+        <w:rPr>
+          <w:color w:val="EE0000"/>
+          <w:sz w:val="32"/>
+          <w:szCs w:val="32"/>
+          <w:lang w:val="en-US"/>
+        </w:rPr>
+        <w:t>).</w:t>
       </w:r>
     </w:p>
     <w:p>
@@ -1409,7 +1457,7 @@
 </file>
 
 <file path=word/numbering.xml><?xml version="1.0" encoding="utf-8"?>
-<w:numbering xmlns:wpc="http://schemas.microsoft.com/office/word/2010/wordprocessingCanvas" xmlns:cx="http://schemas.microsoft.com/office/drawing/2014/chartex" xmlns:cx1="http://schemas.microsoft.com/office/drawing/2015/9/8/chartex" xmlns:cx2="http://schemas.microsoft.com/office/drawing/2015/10/21/chartex" xmlns:cx3="http://schemas.microsoft.com/office/drawing/2016/5/9/chartex" xmlns:cx4="http://schemas.microsoft.com/office/drawing/2016/5/10/chartex" xmlns:cx5="http://schemas.microsoft.com/office/drawing/2016/5/11/chartex" xmlns:cx6="http://schemas.microsoft.com/office/drawing/2016/5/12/chartex" xmlns:cx7="http://schemas.microsoft.com/office/drawing/2016/5/13/chartex" xmlns:cx8="http://schemas.microsoft.com/office/drawing/2016/5/14/chartex" xmlns:mc="http://schemas.openxmlformats.org/markup-compatibility/2006" xmlns:aink="http://schemas.microsoft.com/office/drawing/2016/ink" xmlns:am3d="http://schemas.microsoft.com/office/drawing/2017/model3d" xmlns:o="urn:schemas-microsoft-com:office:office" xmlns:oel="http://schemas.microsoft.com/office/2019/extlst" xmlns:r="http://schemas.openxmlformats.org/officeDocument/2006/relationships" xmlns:m="http://schemas.openxmlformats.org/officeDocument/2006/math" xmlns:v="urn:schemas-microsoft-com:vml" xmlns:wp14="http://schemas.microsoft.com/office/word/2010/wordprocessingDrawing" xmlns:wp="http://schemas.openxmlformats.org/drawingml/2006/wordprocessingDrawing" xmlns:w10="urn:schemas-microsoft-com:office:word" xmlns:w="http://schemas.openxmlformats.org/wordprocessingml/2006/main" xmlns:w14="http://schemas.microsoft.com/office/word/2010/wordml" xmlns:w15="http://schemas.microsoft.com/office/word/2012/wordml" xmlns:w16cex="http://schemas.microsoft.com/office/word/2018/wordml/cex" xmlns:w16cid="http://schemas.microsoft.com/office/word/2016/wordml/cid" xmlns:w16="http://schemas.microsoft.com/office/word/2018/wordml" xmlns:w16du="http://schemas.microsoft.com/office/word/2023/wordml/word16du" xmlns:w16sdtdh="http://schemas.microsoft.com/office/word/2020/wordml/sdtdatahash" xmlns:w16sdtfl="http://schemas.microsoft.com/office/word/2024/wordml/sdtformatlock" xmlns:w16se="http://schemas.microsoft.com/office/word/2015/wordml/symex" xmlns:wpg="http://schemas.microsoft.com/office/word/2010/wordprocessingGroup" xmlns:wpi="http://schemas.microsoft.com/office/word/2010/wordprocessingInk" xmlns:wne="http://schemas.microsoft.com/office/word/2006/wordml" xmlns:wps="http://schemas.microsoft.com/office/word/2010/wordprocessingShape" mc:Ignorable="w14 w15 w16se w16cid w16 w16cex w16sdtdh w16sdtfl w16du wp14">
+<w:numbering xmlns:wpc="http://schemas.microsoft.com/office/word/2010/wordprocessingCanvas" xmlns:cx="http://schemas.microsoft.com/office/drawing/2014/chartex" xmlns:mc="http://schemas.openxmlformats.org/markup-compatibility/2006" xmlns:o="urn:schemas-microsoft-com:office:office" xmlns:r="http://schemas.openxmlformats.org/officeDocument/2006/relationships" xmlns:m="http://schemas.openxmlformats.org/officeDocument/2006/math" xmlns:v="urn:schemas-microsoft-com:vml" xmlns:wp14="http://schemas.microsoft.com/office/word/2010/wordprocessingDrawing" xmlns:wp="http://schemas.openxmlformats.org/drawingml/2006/wordprocessingDrawing" xmlns:w10="urn:schemas-microsoft-com:office:word" xmlns:w="http://schemas.openxmlformats.org/wordprocessingml/2006/main" xmlns:w14="http://schemas.microsoft.com/office/word/2010/wordml" xmlns:w15="http://schemas.microsoft.com/office/word/2012/wordml" xmlns:w16se="http://schemas.microsoft.com/office/word/2015/wordml/symex" xmlns:wpg="http://schemas.microsoft.com/office/word/2010/wordprocessingGroup" xmlns:wpi="http://schemas.microsoft.com/office/word/2010/wordprocessingInk" xmlns:wne="http://schemas.microsoft.com/office/word/2006/wordml" xmlns:wps="http://schemas.microsoft.com/office/word/2010/wordprocessingShape" mc:Ignorable="w14 w15 w16se wp14">
   <w:abstractNum w:abstractNumId="0" w15:restartNumberingAfterBreak="0">
     <w:nsid w:val="1E170E0D"/>
     <w:multiLevelType w:val="multilevel"/>
@@ -1870,26 +1918,26 @@
       </w:pPr>
     </w:lvl>
   </w:abstractNum>
-  <w:num w:numId="1" w16cid:durableId="583495436">
+  <w:num w:numId="1">
     <w:abstractNumId w:val="3"/>
   </w:num>
-  <w:num w:numId="2" w16cid:durableId="1220945091">
+  <w:num w:numId="2">
     <w:abstractNumId w:val="1"/>
   </w:num>
-  <w:num w:numId="3" w16cid:durableId="2118406372">
+  <w:num w:numId="3">
     <w:abstractNumId w:val="0"/>
   </w:num>
-  <w:num w:numId="4" w16cid:durableId="1570186214">
+  <w:num w:numId="4">
     <w:abstractNumId w:val="2"/>
   </w:num>
-  <w:num w:numId="5" w16cid:durableId="387266694">
+  <w:num w:numId="5">
     <w:abstractNumId w:val="4"/>
   </w:num>
 </w:numbering>
 </file>
 
 <file path=word/styles.xml><?xml version="1.0" encoding="utf-8"?>
-<w:styles xmlns:mc="http://schemas.openxmlformats.org/markup-compatibility/2006" xmlns:r="http://schemas.openxmlformats.org/officeDocument/2006/relationships" xmlns:w="http://schemas.openxmlformats.org/wordprocessingml/2006/main" xmlns:w14="http://schemas.microsoft.com/office/word/2010/wordml" xmlns:w15="http://schemas.microsoft.com/office/word/2012/wordml" xmlns:w16cex="http://schemas.microsoft.com/office/word/2018/wordml/cex" xmlns:w16cid="http://schemas.microsoft.com/office/word/2016/wordml/cid" xmlns:w16="http://schemas.microsoft.com/office/word/2018/wordml" xmlns:w16du="http://schemas.microsoft.com/office/word/2023/wordml/word16du" xmlns:w16sdtdh="http://schemas.microsoft.com/office/word/2020/wordml/sdtdatahash" xmlns:w16sdtfl="http://schemas.microsoft.com/office/word/2024/wordml/sdtformatlock" xmlns:w16se="http://schemas.microsoft.com/office/word/2015/wordml/symex" mc:Ignorable="w14 w15 w16se w16cid w16 w16cex w16sdtdh w16sdtfl w16du">
+<w:styles xmlns:mc="http://schemas.openxmlformats.org/markup-compatibility/2006" xmlns:r="http://schemas.openxmlformats.org/officeDocument/2006/relationships" xmlns:w="http://schemas.openxmlformats.org/wordprocessingml/2006/main" xmlns:w14="http://schemas.microsoft.com/office/word/2010/wordml" xmlns:w15="http://schemas.microsoft.com/office/word/2012/wordml" xmlns:w16se="http://schemas.microsoft.com/office/word/2015/wordml/symex" mc:Ignorable="w14 w15 w16se">
   <w:docDefaults>
     <w:rPrDefault>
       <w:rPr>
@@ -1905,7 +1953,7 @@
       </w:pPr>
     </w:pPrDefault>
   </w:docDefaults>
-  <w:latentStyles w:defLockedState="0" w:defUIPriority="99" w:defSemiHidden="0" w:defUnhideWhenUsed="0" w:defQFormat="0" w:count="376">
+  <w:latentStyles w:defLockedState="0" w:defUIPriority="99" w:defSemiHidden="0" w:defUnhideWhenUsed="0" w:defQFormat="0" w:count="371">
     <w:lsdException w:name="Normal" w:uiPriority="0" w:qFormat="1"/>
     <w:lsdException w:name="heading 1" w:uiPriority="9" w:qFormat="1"/>
     <w:lsdException w:name="heading 2" w:semiHidden="1" w:uiPriority="9" w:unhideWhenUsed="1" w:qFormat="1"/>
@@ -2277,11 +2325,6 @@
     <w:lsdException w:name="List Table 5 Dark Accent 6" w:uiPriority="50"/>
     <w:lsdException w:name="List Table 6 Colorful Accent 6" w:uiPriority="51"/>
     <w:lsdException w:name="List Table 7 Colorful Accent 6" w:uiPriority="52"/>
-    <w:lsdException w:name="Mention" w:semiHidden="1" w:unhideWhenUsed="1"/>
-    <w:lsdException w:name="Smart Hyperlink" w:semiHidden="1" w:unhideWhenUsed="1"/>
-    <w:lsdException w:name="Hashtag" w:semiHidden="1" w:unhideWhenUsed="1"/>
-    <w:lsdException w:name="Unresolved Mention" w:semiHidden="1" w:unhideWhenUsed="1"/>
-    <w:lsdException w:name="Smart Link" w:semiHidden="1" w:unhideWhenUsed="1"/>
   </w:latentStyles>
   <w:style w:type="paragraph" w:default="1" w:styleId="Normal">
     <w:name w:val="Normal"/>
@@ -2290,6 +2333,7 @@
   <w:style w:type="character" w:default="1" w:styleId="DefaultParagraphFont">
     <w:name w:val="Default Paragraph Font"/>
     <w:uiPriority w:val="1"/>
+    <w:semiHidden/>
     <w:unhideWhenUsed/>
   </w:style>
   <w:style w:type="table" w:default="1" w:styleId="TableNormal">
@@ -2616,7 +2660,7 @@
 </file>
 
 <file path=customXml/itemProps1.xml><?xml version="1.0" encoding="utf-8"?>
-<ds:datastoreItem xmlns:ds="http://schemas.openxmlformats.org/officeDocument/2006/customXml" ds:itemID="{AE25CDA0-30B0-45BA-AA1B-D2D9F595B360}">
+<ds:datastoreItem xmlns:ds="http://schemas.openxmlformats.org/officeDocument/2006/customXml" ds:itemID="{A99E6852-F83A-4FC4-AA38-7361AE449B99}">
   <ds:schemaRefs>
     <ds:schemaRef ds:uri="http://schemas.openxmlformats.org/officeDocument/2006/bibliography"/>
   </ds:schemaRefs>

</xml_diff>